<commit_message>
A2: post-deposit update with minted Zenodo DOI 10.5281/zenodo.20102959
</commit_message>
<xml_diff>
--- a/04_manuscript/A2/manuscript.docx
+++ b/04_manuscript/A2/manuscript.docx
@@ -1360,7 +1360,7 @@
         <w:t xml:space="preserve"> </w:t>
       </w:r>
       <w:r>
-        <w:t xml:space="preserve">organised into five layers (ingest and harmonisation; pseudo-IPD generation; FACEs estimation, Happ–Greven decomposition, and SRSF registration; classification; inference, bootstrap, sensitivity, and figure generation). All scripts and outputs are deposited at Zenodo (concept DOI 10.5281/zenodo.19743544; v1·3 DOI 10.5281/zenodo.19758429) and on GitHub (</w:t>
+        <w:t xml:space="preserve">organised into five layers (ingest and harmonisation; pseudo-IPD generation; FACEs estimation, Happ–Greven decomposition, and SRSF registration; classification; inference, bootstrap, sensitivity, and figure generation). All scripts and outputs are deposited at Zenodo (concept DOI 10.5281/zenodo.19743544; v2·0-A2 DOI 10.5281/zenodo.20102959) and on GitHub (</w:t>
       </w:r>
       <w:r>
         <w:rPr>
@@ -1372,7 +1372,7 @@
         <w:t xml:space="preserve"> </w:t>
       </w:r>
       <w:r>
-        <w:t xml:space="preserve">v1·3) under CC-BY 4·0. Reporting follows STROBE for cohort studies (with FDA methods supplementing the standard checklist</w:t>
+        <w:t xml:space="preserve">v1·4) under CC-BY 4·0. Reporting follows STROBE for cohort studies (with FDA methods supplementing the standard checklist</w:t>
       </w:r>
       <w:r>
         <w:rPr>
@@ -2255,7 +2255,7 @@
         <w:t xml:space="preserve"> </w:t>
       </w:r>
       <w:r>
-        <w:t xml:space="preserve">v1·3 and subsequent branches) under CC-BY 4·0. The repository permits full reproduction of every numerical claim and follows FAIR data principles. Pre-registration is at the Open Science Framework (DOI 10.17605/OSF.IO/3CZRE; project at https://osf.io/tr469, frozen 2026-04-22).</w:t>
+        <w:t xml:space="preserve">v1·4 and subsequent branches) under CC-BY 4·0. The repository permits full reproduction of every numerical claim and follows FAIR data principles. Pre-registration is at the Open Science Framework (DOI 10.17605/OSF.IO/3CZRE; project at https://osf.io/tr469, frozen 2026-04-22).</w:t>
       </w:r>
     </w:p>
     <w:bookmarkEnd w:id="37"/>

</xml_diff>